<commit_message>
atualizacao: recursao + campos + cnpj + alfa + aditivo + botao
</commit_message>
<xml_diff>
--- a/aditivo.docx
+++ b/aditivo.docx
@@ -112,7 +112,6 @@
     <w:p>
       <w:pPr>
         <w:spacing w:before="240" w:after="120"/>
-        <w:jc w:val="left"/>
       </w:pPr>
       <w:r>
         <w:rPr>
@@ -211,7 +210,6 @@
     <w:p>
       <w:pPr>
         <w:spacing w:before="240" w:after="120"/>
-        <w:jc w:val="left"/>
       </w:pPr>
       <w:r>
         <w:rPr>
@@ -250,7 +248,6 @@
     <w:p>
       <w:pPr>
         <w:spacing w:before="240" w:after="120"/>
-        <w:jc w:val="left"/>
       </w:pPr>
       <w:r>
         <w:rPr>
@@ -300,7 +297,7 @@
     </w:p>
     <w:p>
       <w:pPr>
-        <w:spacing w:before="0" w:after="40"/>
+        <w:spacing w:after="40"/>
         <w:jc w:val="center"/>
         <w:pBdr>
           <w:top w:val="single" w:sz="6" w:space="1" w:color="0D2A4A"/>
@@ -337,7 +334,7 @@
     <w:p/>
     <w:p>
       <w:pPr>
-        <w:spacing w:before="0" w:after="40"/>
+        <w:spacing w:after="40"/>
         <w:jc w:val="center"/>
         <w:pBdr>
           <w:top w:val="single" w:sz="6" w:space="1" w:color="0D2A4A"/>

</xml_diff>

<commit_message>
feat: aditivo RT em padrão premium Aqua Gestão
</commit_message>
<xml_diff>
--- a/aditivo.docx
+++ b/aditivo.docx
@@ -2,381 +2,623 @@
 <file path=word/document.xml><?xml version="1.0" encoding="utf-8"?>
 <w:document xmlns:wpc="http://schemas.microsoft.com/office/word/2010/wordprocessingCanvas" xmlns:mo="http://schemas.microsoft.com/office/mac/office/2008/main" xmlns:mc="http://schemas.openxmlformats.org/markup-compatibility/2006" xmlns:mv="urn:schemas-microsoft-com:mac:vml" xmlns:o="urn:schemas-microsoft-com:office:office" xmlns:r="http://schemas.openxmlformats.org/officeDocument/2006/relationships" xmlns:m="http://schemas.openxmlformats.org/officeDocument/2006/math" xmlns:v="urn:schemas-microsoft-com:vml" xmlns:wp14="http://schemas.microsoft.com/office/word/2010/wordprocessingDrawing" xmlns:wp="http://schemas.openxmlformats.org/drawingml/2006/wordprocessingDrawing" xmlns:w10="urn:schemas-microsoft-com:office:word" xmlns:w="http://schemas.openxmlformats.org/wordprocessingml/2006/main" xmlns:w14="http://schemas.microsoft.com/office/word/2010/wordml" xmlns:wpg="http://schemas.microsoft.com/office/word/2010/wordprocessingGroup" xmlns:wpi="http://schemas.microsoft.com/office/word/2010/wordprocessingInk" xmlns:wne="http://schemas.microsoft.com/office/word/2006/wordml" xmlns:wps="http://schemas.microsoft.com/office/word/2010/wordprocessingShape" mc:Ignorable="w14 wp14">
   <w:body>
+    <w:tbl>
+      <w:tblPr>
+        <w:tblW w:type="auto" w:w="0"/>
+        <w:jc w:val="center"/>
+        <w:tblLook w:firstColumn="1" w:firstRow="1" w:lastColumn="0" w:lastRow="0" w:noHBand="0" w:noVBand="1" w:val="04A0"/>
+      </w:tblPr>
+      <w:tblGrid>
+        <w:gridCol w:w="5156"/>
+        <w:gridCol w:w="5156"/>
+      </w:tblGrid>
+      <w:tr>
+        <w:tc>
+          <w:tcPr>
+            <w:tcW w:type="dxa" w:w="5156"/>
+            <w:shd w:fill="EAF4FF"/>
+            <w:tcBorders>
+              <w:top w:val="single" w:sz="8" w:space="0" w:color="D7E6F5"/>
+              <w:left w:val="single" w:sz="8" w:space="0" w:color="D7E6F5"/>
+              <w:bottom w:val="single" w:sz="8" w:space="0" w:color="D7E6F5"/>
+              <w:right w:val="single" w:sz="8" w:space="0" w:color="D7E6F5"/>
+            </w:tcBorders>
+            <w:vAlign w:val="center"/>
+          </w:tcPr>
+          <w:p>
+            <w:pPr>
+              <w:jc w:val="center"/>
+            </w:pPr>
+            <w:r>
+              <w:drawing>
+                <wp:inline xmlns:a="http://schemas.openxmlformats.org/drawingml/2006/main" xmlns:pic="http://schemas.openxmlformats.org/drawingml/2006/picture">
+                  <wp:extent cx="864000" cy="631800"/>
+                  <wp:docPr id="1" name="Picture 1"/>
+                  <wp:cNvGraphicFramePr>
+                    <a:graphicFrameLocks noChangeAspect="1"/>
+                  </wp:cNvGraphicFramePr>
+                  <a:graphic>
+                    <a:graphicData uri="http://schemas.openxmlformats.org/drawingml/2006/picture">
+                      <pic:pic>
+                        <pic:nvPicPr>
+                          <pic:cNvPr id="0" name="aqua_gestao_logo.png"/>
+                          <pic:cNvPicPr/>
+                        </pic:nvPicPr>
+                        <pic:blipFill>
+                          <a:blip r:embed="rId11"/>
+                          <a:stretch>
+                            <a:fillRect/>
+                          </a:stretch>
+                        </pic:blipFill>
+                        <pic:spPr>
+                          <a:xfrm>
+                            <a:off x="0" y="0"/>
+                            <a:ext cx="864000" cy="631800"/>
+                          </a:xfrm>
+                          <a:prstGeom prst="rect"/>
+                        </pic:spPr>
+                      </pic:pic>
+                    </a:graphicData>
+                  </a:graphic>
+                </wp:inline>
+              </w:drawing>
+            </w:r>
+          </w:p>
+        </w:tc>
+        <w:tc>
+          <w:tcPr>
+            <w:tcW w:type="dxa" w:w="5156"/>
+            <w:shd w:fill="EAF4FF"/>
+            <w:tcBorders>
+              <w:top w:val="single" w:sz="8" w:space="0" w:color="D7E6F5"/>
+              <w:left w:val="single" w:sz="8" w:space="0" w:color="D7E6F5"/>
+              <w:bottom w:val="single" w:sz="8" w:space="0" w:color="D7E6F5"/>
+              <w:right w:val="single" w:sz="8" w:space="0" w:color="D7E6F5"/>
+            </w:tcBorders>
+            <w:vAlign w:val="center"/>
+          </w:tcPr>
+          <w:p>
+            <w:pPr>
+              <w:jc w:val="center"/>
+            </w:pPr>
+            <w:r>
+              <w:rPr>
+                <w:b/>
+                <w:color w:val="0B2E59"/>
+                <w:sz w:val="26"/>
+              </w:rPr>
+              <w:t>1º TERMO ADITIVO AO CONTRATO DE PRESTAÇÃO DE SERVIÇOS</w:t>
+              <w:br/>
+            </w:r>
+            <w:r>
+              <w:rPr>
+                <w:b/>
+                <w:color w:val="0F4C81"/>
+                <w:sz w:val="20"/>
+              </w:rPr>
+              <w:t>RESPONSABILIDADE TÉCNICA – CONTROLE TÉCNICO DE PISCINAS</w:t>
+              <w:br/>
+            </w:r>
+            <w:r>
+              <w:rPr>
+                <w:color w:val="4B5563"/>
+                <w:sz w:val="18"/>
+              </w:rPr>
+              <w:t>Aditivo comercial para concessão de desconto, sem alteração do escopo técnico contratado.</w:t>
+            </w:r>
+          </w:p>
+        </w:tc>
+      </w:tr>
+    </w:tbl>
     <w:p>
       <w:pPr>
-        <w:spacing w:before="0" w:after="40"/>
-        <w:jc w:val="right"/>
+        <w:spacing w:after="60"/>
       </w:pPr>
       <w:r>
         <w:rPr>
-          <w:b/>
-          <w:sz w:val="17"/>
+          <w:rFonts w:ascii="Arial" w:hAnsi="Arial"/>
+          <w:b w:val="0"/>
+          <w:color w:val="1F2937"/>
+          <w:sz w:val="20"/>
         </w:rPr>
-        <w:t>Aqua Gestão – Controle Técnico de Piscinas</w:t>
       </w:r>
     </w:p>
-    <w:p/>
+    <w:tbl>
+      <w:tblPr>
+        <w:tblW w:type="auto" w:w="0"/>
+        <w:jc w:val="center"/>
+        <w:tblLook w:firstColumn="1" w:firstRow="1" w:lastColumn="0" w:lastRow="0" w:noHBand="0" w:noVBand="1" w:val="04A0"/>
+      </w:tblPr>
+      <w:tblGrid>
+        <w:gridCol w:w="5156"/>
+        <w:gridCol w:w="5156"/>
+      </w:tblGrid>
+      <w:tr>
+        <w:tc>
+          <w:tcPr>
+            <w:tcW w:type="dxa" w:w="5156"/>
+            <w:shd w:fill="F3F8FF"/>
+            <w:tcBorders>
+              <w:top w:val="single" w:sz="8" w:space="0" w:color="D7E6F5"/>
+              <w:left w:val="single" w:sz="8" w:space="0" w:color="D7E6F5"/>
+              <w:bottom w:val="single" w:sz="8" w:space="0" w:color="D7E6F5"/>
+              <w:right w:val="single" w:sz="8" w:space="0" w:color="D7E6F5"/>
+            </w:tcBorders>
+          </w:tcPr>
+          <w:p>
+            <w:r>
+              <w:rPr>
+                <w:rFonts w:ascii="Arial" w:hAnsi="Arial"/>
+                <w:color w:val="1F2937"/>
+                <w:sz w:val="17"/>
+              </w:rPr>
+              <w:t>CONTRATADA</w:t>
+            </w:r>
+          </w:p>
+        </w:tc>
+        <w:tc>
+          <w:tcPr>
+            <w:tcW w:type="dxa" w:w="5156"/>
+            <w:tcBorders>
+              <w:top w:val="single" w:sz="8" w:space="0" w:color="D7E6F5"/>
+              <w:left w:val="single" w:sz="8" w:space="0" w:color="D7E6F5"/>
+              <w:bottom w:val="single" w:sz="8" w:space="0" w:color="D7E6F5"/>
+              <w:right w:val="single" w:sz="8" w:space="0" w:color="D7E6F5"/>
+            </w:tcBorders>
+          </w:tcPr>
+          <w:p>
+            <w:r>
+              <w:rPr>
+                <w:rFonts w:ascii="Arial" w:hAnsi="Arial"/>
+                <w:color w:val="1F2937"/>
+                <w:sz w:val="17"/>
+              </w:rPr>
+              <w:t>AQUA GESTÃO CONTROLE TÉCNICO LTDA</w:t>
+              <w:br/>
+              <w:t>CNPJ 66.008.795/0001-92</w:t>
+            </w:r>
+          </w:p>
+        </w:tc>
+      </w:tr>
+      <w:tr>
+        <w:tc>
+          <w:tcPr>
+            <w:tcW w:type="dxa" w:w="5156"/>
+            <w:shd w:fill="F3F8FF"/>
+            <w:tcBorders>
+              <w:top w:val="single" w:sz="8" w:space="0" w:color="D7E6F5"/>
+              <w:left w:val="single" w:sz="8" w:space="0" w:color="D7E6F5"/>
+              <w:bottom w:val="single" w:sz="8" w:space="0" w:color="D7E6F5"/>
+              <w:right w:val="single" w:sz="8" w:space="0" w:color="D7E6F5"/>
+            </w:tcBorders>
+          </w:tcPr>
+          <w:p>
+            <w:r>
+              <w:rPr>
+                <w:rFonts w:ascii="Arial" w:hAnsi="Arial"/>
+                <w:color w:val="1F2937"/>
+                <w:sz w:val="17"/>
+              </w:rPr>
+              <w:t>CONTRATANTE</w:t>
+            </w:r>
+          </w:p>
+        </w:tc>
+        <w:tc>
+          <w:tcPr>
+            <w:tcW w:type="dxa" w:w="5156"/>
+            <w:tcBorders>
+              <w:top w:val="single" w:sz="8" w:space="0" w:color="D7E6F5"/>
+              <w:left w:val="single" w:sz="8" w:space="0" w:color="D7E6F5"/>
+              <w:bottom w:val="single" w:sz="8" w:space="0" w:color="D7E6F5"/>
+              <w:right w:val="single" w:sz="8" w:space="0" w:color="D7E6F5"/>
+            </w:tcBorders>
+          </w:tcPr>
+          <w:p>
+            <w:r>
+              <w:rPr>
+                <w:rFonts w:ascii="Arial" w:hAnsi="Arial"/>
+                <w:color w:val="1F2937"/>
+                <w:sz w:val="17"/>
+              </w:rPr>
+              <w:t>{{NOME_CONDOMINIO}}</w:t>
+              <w:br/>
+              <w:t>CNPJ/CPF: {{CNPJ_CONDOMINIO}}</w:t>
+              <w:br/>
+              <w:t>{{ENDERECO_CONDOMINIO}}</w:t>
+            </w:r>
+          </w:p>
+        </w:tc>
+      </w:tr>
+      <w:tr>
+        <w:tc>
+          <w:tcPr>
+            <w:tcW w:type="dxa" w:w="5156"/>
+            <w:shd w:fill="F3F8FF"/>
+            <w:tcBorders>
+              <w:top w:val="single" w:sz="8" w:space="0" w:color="D7E6F5"/>
+              <w:left w:val="single" w:sz="8" w:space="0" w:color="D7E6F5"/>
+              <w:bottom w:val="single" w:sz="8" w:space="0" w:color="D7E6F5"/>
+              <w:right w:val="single" w:sz="8" w:space="0" w:color="D7E6F5"/>
+            </w:tcBorders>
+          </w:tcPr>
+          <w:p>
+            <w:r>
+              <w:rPr>
+                <w:rFonts w:ascii="Arial" w:hAnsi="Arial"/>
+                <w:color w:val="1F2937"/>
+                <w:sz w:val="17"/>
+              </w:rPr>
+              <w:t>CONTRATO BASE</w:t>
+            </w:r>
+          </w:p>
+        </w:tc>
+        <w:tc>
+          <w:tcPr>
+            <w:tcW w:type="dxa" w:w="5156"/>
+            <w:tcBorders>
+              <w:top w:val="single" w:sz="8" w:space="0" w:color="D7E6F5"/>
+              <w:left w:val="single" w:sz="8" w:space="0" w:color="D7E6F5"/>
+              <w:bottom w:val="single" w:sz="8" w:space="0" w:color="D7E6F5"/>
+              <w:right w:val="single" w:sz="8" w:space="0" w:color="D7E6F5"/>
+            </w:tcBorders>
+          </w:tcPr>
+          <w:p>
+            <w:r>
+              <w:rPr>
+                <w:rFonts w:ascii="Arial" w:hAnsi="Arial"/>
+                <w:color w:val="1F2937"/>
+                <w:sz w:val="17"/>
+              </w:rPr>
+              <w:t>Contrato de Prestação de Serviços de Responsabilidade Técnica firmado em {{DATA_INICIO_CONTRATO}}, com vigência até {{DATA_FIM_CONTRATO}}.</w:t>
+            </w:r>
+          </w:p>
+        </w:tc>
+      </w:tr>
+    </w:tbl>
     <w:p>
       <w:pPr>
-        <w:spacing w:before="0" w:after="40"/>
-        <w:jc w:val="center"/>
+        <w:spacing w:after="40"/>
       </w:pPr>
       <w:r>
         <w:rPr>
+          <w:rFonts w:ascii="Arial" w:hAnsi="Arial"/>
           <w:b/>
-          <w:sz w:val="28"/>
+          <w:color w:val="0B2E59"/>
+          <w:sz w:val="21"/>
         </w:rPr>
-        <w:t>1º TERMO ADITIVO AO CONTRATO DE PRESTAÇÃO DE SERVIÇOS</w:t>
+        <w:t>CLÁUSULA PRIMEIRA — DO DESCONTO COMERCIAL</w:t>
       </w:r>
     </w:p>
     <w:p>
       <w:pPr>
-        <w:spacing w:before="0" w:after="80"/>
-        <w:jc w:val="center"/>
+        <w:spacing w:after="60"/>
       </w:pPr>
       <w:r>
         <w:rPr>
-          <w:b/>
-          <w:sz w:val="28"/>
+          <w:rFonts w:ascii="Arial" w:hAnsi="Arial"/>
+          <w:b w:val="0"/>
+          <w:color w:val="C9A227"/>
+          <w:sz w:val="12"/>
         </w:rPr>
-        <w:t>RESPONSABILIDADE TÉCNICA – CONTROLE TÉCNICO DE PISCINAS</w:t>
+        <w:t>━━━━━━━━━━━━━━━━━━━━━━━━━━━━━━━━━━━━━━━━━━━━━━━━━━━━━━━━━━━━━━━━━━━━━━━━━━━━━━━━</w:t>
       </w:r>
     </w:p>
     <w:p>
       <w:pPr>
-        <w:spacing w:before="0" w:after="200"/>
-        <w:jc w:val="center"/>
+        <w:spacing w:after="80"/>
+        <w:jc w:val="both"/>
       </w:pPr>
       <w:r>
         <w:rPr>
+          <w:rFonts w:ascii="Arial" w:hAnsi="Arial"/>
           <w:b w:val="0"/>
+          <w:color w:val="1F2937"/>
           <w:sz w:val="18"/>
         </w:rPr>
-        <w:t>Aditivo comercial para concessão de desconto, sem alteração do escopo técnico contratado.</w:t>
+        <w:t>A CONTRATADA concede à CONTRATANTE, por mera liberalidade e em caráter comercial específico, desconto especial sobre os honorários mensais previstos no contrato base.</w:t>
       </w:r>
     </w:p>
     <w:p>
       <w:pPr>
-        <w:spacing w:before="0" w:after="60"/>
+        <w:spacing w:after="80"/>
         <w:jc w:val="both"/>
       </w:pPr>
       <w:r>
         <w:rPr>
-          <w:b/>
-        </w:rPr>
-        <w:t xml:space="preserve">CONTRATADA: </w:t>
-      </w:r>
-      <w:r>
-        <w:rPr>
+          <w:rFonts w:ascii="Arial" w:hAnsi="Arial"/>
           <w:b w:val="0"/>
-        </w:rPr>
-        <w:t>AQUA GESTAO CONTROLE TECNICO LTDA — CNPJ 66.008.795/0001-92.</w:t>
-      </w:r>
-    </w:p>
-    <w:p>
-      <w:pPr>
-        <w:spacing w:before="0" w:after="60"/>
-        <w:jc w:val="both"/>
-      </w:pPr>
-      <w:r>
-        <w:rPr>
-          <w:b/>
-        </w:rPr>
-        <w:t xml:space="preserve">CONTRATANTE: </w:t>
-      </w:r>
-      <w:r>
-        <w:rPr>
-          <w:b w:val="0"/>
-        </w:rPr>
-        <w:t>{{NOME_CONDOMINIO}} — CNPJ {{CNPJ_CONDOMINIO}}</w:t>
-      </w:r>
-    </w:p>
-    <w:p>
-      <w:pPr>
-        <w:spacing w:before="0" w:after="200"/>
-        <w:jc w:val="both"/>
-      </w:pPr>
-      <w:r>
-        <w:rPr>
-          <w:b/>
-        </w:rPr>
-        <w:t xml:space="preserve">Contrato base: </w:t>
-      </w:r>
-      <w:r>
-        <w:rPr>
-          <w:b w:val="0"/>
-        </w:rPr>
-        <w:t>Contrato de Prestação de Serviços de Responsabilidade Técnica firmado em 01 de abril de 2026.</w:t>
-      </w:r>
-    </w:p>
-    <w:p>
-      <w:pPr>
-        <w:spacing w:before="240" w:after="120"/>
-      </w:pPr>
-      <w:r>
-        <w:rPr>
-          <w:b/>
-          <w:color w:val="0D2A4A"/>
-          <w:sz w:val="22"/>
-        </w:rPr>
-        <w:t>CLÁUSULA PRIMEIRA — DO DESCONTO COMERCIAL</w:t>
-      </w:r>
-    </w:p>
-    <w:p/>
-    <w:p>
-      <w:pPr>
-        <w:spacing w:before="0" w:after="120"/>
-        <w:jc w:val="both"/>
-      </w:pPr>
-      <w:r>
-        <w:rPr>
-          <w:b w:val="0"/>
-        </w:rPr>
-        <w:t xml:space="preserve">A CONTRATADA concede à CONTRATANTE, por mera liberalidade e em caráter comercial específico, </w:t>
-      </w:r>
-      <w:r>
-        <w:rPr>
-          <w:b/>
-        </w:rPr>
-        <w:t>desconto especial</w:t>
-      </w:r>
-      <w:r>
-        <w:rPr>
-          <w:b w:val="0"/>
-        </w:rPr>
-        <w:t xml:space="preserve"> sobre os honorários mensais previstos no contrato base.</w:t>
-      </w:r>
-    </w:p>
-    <w:p>
-      <w:pPr>
-        <w:spacing w:before="0" w:after="120"/>
-        <w:jc w:val="both"/>
-      </w:pPr>
-      <w:r>
-        <w:rPr>
-          <w:b w:val="0"/>
+          <w:color w:val="1F2937"/>
+          <w:sz w:val="18"/>
         </w:rPr>
         <w:t>Em razão do desconto ora concedido, o valor mensal contratual passa de {{VALOR_MENSAL}} para {{VALOR_ADITIVO}}.</w:t>
       </w:r>
     </w:p>
     <w:p>
       <w:pPr>
-        <w:spacing w:before="0" w:after="120"/>
+        <w:spacing w:after="80"/>
         <w:jc w:val="both"/>
       </w:pPr>
       <w:r>
         <w:rPr>
+          <w:rFonts w:ascii="Arial" w:hAnsi="Arial"/>
           <w:b w:val="0"/>
+          <w:color w:val="1F2937"/>
+          <w:sz w:val="18"/>
         </w:rPr>
         <w:t>O desconto previsto neste aditivo possui natureza excepcional, discricionária, revogável e não vinculante, não constituindo direito adquirido, permanência obrigatória, política geral de preços, cláusula de exclusividade ou condição compulsória de contratação de quaisquer outros produtos ou serviços.</w:t>
       </w:r>
     </w:p>
     <w:p>
       <w:pPr>
-        <w:spacing w:before="0" w:after="120"/>
+        <w:spacing w:after="80"/>
         <w:jc w:val="both"/>
       </w:pPr>
       <w:r>
         <w:rPr>
+          <w:rFonts w:ascii="Arial" w:hAnsi="Arial"/>
           <w:b w:val="0"/>
+          <w:color w:val="1F2937"/>
+          <w:sz w:val="18"/>
         </w:rPr>
-        <w:t xml:space="preserve">O desconto decorre exclusivamente de avaliação comercial global realizada pela CONTRATADA no contexto da contratação, podendo ser revisto, reduzido ou suprimido, total ou parcialmente, mediante </w:t>
-      </w:r>
-      <w:r>
-        <w:rPr>
-          <w:b/>
-        </w:rPr>
-        <w:t>notificação prévia por escrito de 30 (trinta) dias</w:t>
-      </w:r>
-      <w:r>
-        <w:rPr>
-          <w:b w:val="0"/>
-        </w:rPr>
-        <w:t>, caso deixem de existir as premissas negociais que motivaram sua concessão.</w:t>
+        <w:t>O desconto decorre exclusivamente de avaliação comercial global realizada pela CONTRATADA no contexto da contratação, podendo ser revisto, reduzido ou suprimido, total ou parcialmente, mediante notificação prévia por escrito de 30 (trinta) dias, caso deixem de existir as premissas negociais que motivaram sua concessão.</w:t>
       </w:r>
     </w:p>
     <w:p>
       <w:pPr>
-        <w:spacing w:before="0" w:after="120"/>
+        <w:spacing w:after="80"/>
         <w:jc w:val="both"/>
       </w:pPr>
       <w:r>
         <w:rPr>
+          <w:rFonts w:ascii="Arial" w:hAnsi="Arial"/>
           <w:b w:val="0"/>
+          <w:color w:val="1F2937"/>
+          <w:sz w:val="18"/>
         </w:rPr>
         <w:t>A supressão do desconto não implicará alteração do escopo técnico contratado, passando a vigorar, após o prazo de notificação, o valor contratual ordinário então vigente, já considerado eventual reajuste aplicável.</w:t>
       </w:r>
     </w:p>
     <w:p>
       <w:pPr>
-        <w:spacing w:before="240" w:after="120"/>
+        <w:spacing w:after="40"/>
       </w:pPr>
       <w:r>
         <w:rPr>
+          <w:rFonts w:ascii="Arial" w:hAnsi="Arial"/>
           <w:b/>
-          <w:color w:val="0D2A4A"/>
-          <w:sz w:val="22"/>
+          <w:color w:val="0B2E59"/>
+          <w:sz w:val="21"/>
         </w:rPr>
         <w:t>CLÁUSULA SEGUNDA — DO REAJUSTE</w:t>
       </w:r>
     </w:p>
-    <w:p/>
     <w:p>
       <w:pPr>
-        <w:spacing w:before="0" w:after="120"/>
+        <w:spacing w:after="60"/>
+      </w:pPr>
+      <w:r>
+        <w:rPr>
+          <w:rFonts w:ascii="Arial" w:hAnsi="Arial"/>
+          <w:b w:val="0"/>
+          <w:color w:val="C9A227"/>
+          <w:sz w:val="12"/>
+        </w:rPr>
+        <w:t>━━━━━━━━━━━━━━━━━━━━━━━━━━━━━━━━━━━━━━━━━━━━━━━━━━━━━━━━━━━━━━━━━━━━━━━━━━━━━━━━</w:t>
+      </w:r>
+    </w:p>
+    <w:p>
+      <w:pPr>
+        <w:spacing w:after="80"/>
         <w:jc w:val="both"/>
       </w:pPr>
       <w:r>
         <w:rPr>
+          <w:rFonts w:ascii="Arial" w:hAnsi="Arial"/>
           <w:b w:val="0"/>
+          <w:color w:val="1F2937"/>
+          <w:sz w:val="18"/>
         </w:rPr>
         <w:t>O valor com desconto será reajustado anualmente pelo mesmo critério previsto no contrato base.</w:t>
       </w:r>
     </w:p>
     <w:p>
       <w:pPr>
-        <w:spacing w:before="0" w:after="120"/>
+        <w:spacing w:after="80"/>
         <w:jc w:val="both"/>
       </w:pPr>
       <w:r>
         <w:rPr>
+          <w:rFonts w:ascii="Arial" w:hAnsi="Arial"/>
           <w:b w:val="0"/>
+          <w:color w:val="1F2937"/>
+          <w:sz w:val="18"/>
         </w:rPr>
         <w:t>Na hipótese de cessação do desconto, o valor ordinário restabelecido também observará o mesmo critério de reajuste contratual.</w:t>
       </w:r>
     </w:p>
     <w:p>
       <w:pPr>
-        <w:spacing w:before="240" w:after="120"/>
+        <w:spacing w:after="40"/>
       </w:pPr>
       <w:r>
         <w:rPr>
+          <w:rFonts w:ascii="Arial" w:hAnsi="Arial"/>
           <w:b/>
-          <w:color w:val="0D2A4A"/>
-          <w:sz w:val="22"/>
+          <w:color w:val="0B2E59"/>
+          <w:sz w:val="21"/>
         </w:rPr>
         <w:t>CLÁUSULA TERCEIRA — DA VIGÊNCIA</w:t>
       </w:r>
     </w:p>
-    <w:p/>
     <w:p>
       <w:pPr>
-        <w:spacing w:before="0" w:after="120"/>
+        <w:spacing w:after="60"/>
+      </w:pPr>
+      <w:r>
+        <w:rPr>
+          <w:rFonts w:ascii="Arial" w:hAnsi="Arial"/>
+          <w:b w:val="0"/>
+          <w:color w:val="C9A227"/>
+          <w:sz w:val="12"/>
+        </w:rPr>
+        <w:t>━━━━━━━━━━━━━━━━━━━━━━━━━━━━━━━━━━━━━━━━━━━━━━━━━━━━━━━━━━━━━━━━━━━━━━━━━━━━━━━━</w:t>
+      </w:r>
+    </w:p>
+    <w:p>
+      <w:pPr>
+        <w:spacing w:after="80"/>
         <w:jc w:val="both"/>
       </w:pPr>
       <w:r>
         <w:rPr>
+          <w:rFonts w:ascii="Arial" w:hAnsi="Arial"/>
           <w:b w:val="0"/>
+          <w:color w:val="1F2937"/>
+          <w:sz w:val="18"/>
         </w:rPr>
         <w:t>O presente Termo Aditivo entra em vigor na data de sua assinatura e produzirá efeitos financeiros a partir do próximo vencimento contratual.</w:t>
       </w:r>
     </w:p>
     <w:p>
       <w:pPr>
-        <w:spacing w:before="0" w:after="320"/>
+        <w:spacing w:after="80"/>
         <w:jc w:val="both"/>
       </w:pPr>
       <w:r>
         <w:rPr>
+          <w:rFonts w:ascii="Arial" w:hAnsi="Arial"/>
           <w:b w:val="0"/>
+          <w:color w:val="1F2937"/>
+          <w:sz w:val="18"/>
         </w:rPr>
         <w:t>Permanecem inalteradas e ratificadas todas as demais cláusulas do contrato base não expressamente modificadas por este aditivo.</w:t>
       </w:r>
     </w:p>
     <w:p>
       <w:pPr>
-        <w:spacing w:before="0" w:after="400"/>
+        <w:spacing w:after="360"/>
         <w:jc w:val="center"/>
       </w:pPr>
       <w:r>
         <w:rPr>
+          <w:rFonts w:ascii="Arial" w:hAnsi="Arial"/>
           <w:b w:val="0"/>
+          <w:color w:val="1F2937"/>
+          <w:sz w:val="18"/>
         </w:rPr>
         <w:t>{{LOCAL_DATA_ASSINATURA}}</w:t>
       </w:r>
     </w:p>
-    <w:p>
-      <w:pPr>
-        <w:spacing w:after="40"/>
+    <w:tbl>
+      <w:tblPr>
+        <w:tblW w:type="auto" w:w="0"/>
         <w:jc w:val="center"/>
-        <w:pBdr>
-          <w:top w:val="single" w:sz="6" w:space="1" w:color="0D2A4A"/>
-        </w:pBdr>
-      </w:pPr>
-      <w:r>
-        <w:rPr>
-          <w:b/>
-        </w:rPr>
-        <w:t>CONTRATADA</w:t>
-      </w:r>
-    </w:p>
-    <w:p>
-      <w:pPr>
-        <w:spacing w:after="0"/>
-        <w:jc w:val="center"/>
-      </w:pPr>
-      <w:r>
-        <w:t>AQUA GESTAO CONTROLE TECNICO LTDA</w:t>
-      </w:r>
-    </w:p>
-    <w:p>
-      <w:pPr>
-        <w:spacing w:after="0"/>
-        <w:jc w:val="center"/>
-      </w:pPr>
-      <w:r>
-        <w:rPr>
-          <w:sz w:val="18"/>
-        </w:rPr>
-        <w:t>Thyago Fernando da Silveira | CRQ 024025748 | Técnico em Química</w:t>
-      </w:r>
-    </w:p>
-    <w:p/>
-    <w:p>
-      <w:pPr>
-        <w:spacing w:after="40"/>
-        <w:jc w:val="center"/>
-        <w:pBdr>
-          <w:top w:val="single" w:sz="6" w:space="1" w:color="0D2A4A"/>
-        </w:pBdr>
-      </w:pPr>
-      <w:r>
-        <w:rPr>
-          <w:b/>
-        </w:rPr>
-        <w:t>CONTRATANTE</w:t>
-      </w:r>
-    </w:p>
-    <w:p>
-      <w:pPr>
-        <w:spacing w:after="0"/>
-        <w:jc w:val="center"/>
-      </w:pPr>
-      <w:r>
-        <w:t>{{NOME_CONDOMINIO}}</w:t>
-      </w:r>
-    </w:p>
-    <w:p>
-      <w:pPr>
-        <w:spacing w:after="0"/>
-        <w:jc w:val="center"/>
-      </w:pPr>
-      <w:r>
-        <w:rPr>
-          <w:sz w:val="18"/>
-        </w:rPr>
-        <w:t>{{NOME_SINDICO}} — {{CARGO_SINDICO}}</w:t>
-      </w:r>
-    </w:p>
-    <w:p/>
+        <w:tblLook w:firstColumn="1" w:firstRow="1" w:lastColumn="0" w:lastRow="0" w:noHBand="0" w:noVBand="1" w:val="04A0"/>
+      </w:tblPr>
+      <w:tblGrid>
+        <w:gridCol w:w="5156"/>
+        <w:gridCol w:w="5156"/>
+      </w:tblGrid>
+      <w:tr>
+        <w:tc>
+          <w:tcPr>
+            <w:tcW w:type="dxa" w:w="5156"/>
+          </w:tcPr>
+          <w:p>
+            <w:pPr>
+              <w:jc w:val="center"/>
+            </w:pPr>
+            <w:r>
+              <w:rPr>
+                <w:rFonts w:ascii="Arial" w:hAnsi="Arial"/>
+                <w:color w:val="1F2937"/>
+                <w:sz w:val="17"/>
+              </w:rPr>
+              <w:t>_________________________________________</w:t>
+              <w:br/>
+              <w:t>CONTRATADA</w:t>
+              <w:br/>
+              <w:t>AQUA GESTÃO CONTROLE TÉCNICO LTDA</w:t>
+              <w:br/>
+              <w:t>Thyago Fernando da Silveira</w:t>
+              <w:br/>
+              <w:t>CRQ 024025748 | Técnico em Química</w:t>
+            </w:r>
+          </w:p>
+        </w:tc>
+        <w:tc>
+          <w:tcPr>
+            <w:tcW w:type="dxa" w:w="5156"/>
+          </w:tcPr>
+          <w:p>
+            <w:pPr>
+              <w:jc w:val="center"/>
+            </w:pPr>
+            <w:r>
+              <w:rPr>
+                <w:rFonts w:ascii="Arial" w:hAnsi="Arial"/>
+                <w:color w:val="1F2937"/>
+                <w:sz w:val="17"/>
+              </w:rPr>
+              <w:t>_________________________________________</w:t>
+              <w:br/>
+              <w:t>CONTRATANTE</w:t>
+              <w:br/>
+              <w:t>{{NOME_CONDOMINIO}}</w:t>
+              <w:br/>
+              <w:t>{{NOME_SINDICO}} — {{CARGO_SINDICO}}</w:t>
+            </w:r>
+          </w:p>
+        </w:tc>
+      </w:tr>
+    </w:tbl>
     <w:sectPr>
+      <w:headerReference w:type="default" r:id="rId9"/>
+      <w:footerReference w:type="default" r:id="rId10"/>
       <w:pgSz w:w="12240" w:h="15840"/>
-      <w:pgMar w:top="1134" w:right="1134" w:bottom="1134" w:left="1701" w:header="720" w:footer="720" w:gutter="0"/>
+      <w:pgMar w:top="964" w:right="964" w:bottom="850" w:left="964" w:header="720" w:footer="720" w:gutter="0"/>
       <w:cols w:space="720"/>
       <w:docGrid w:linePitch="360"/>
     </w:sectPr>
   </w:body>
 </w:document>
+</file>
+
+<file path=word/footer1.xml><?xml version="1.0" encoding="utf-8"?>
+<w:ftr xmlns:m="http://schemas.openxmlformats.org/officeDocument/2006/math" xmlns:mc="http://schemas.openxmlformats.org/markup-compatibility/2006" xmlns:mo="http://schemas.microsoft.com/office/mac/office/2008/main" xmlns:mv="urn:schemas-microsoft-com:mac:vml" xmlns:o="urn:schemas-microsoft-com:office:office" xmlns:r="http://schemas.openxmlformats.org/officeDocument/2006/relationships" xmlns:v="urn:schemas-microsoft-com:vml" xmlns:w10="urn:schemas-microsoft-com:office:word" xmlns:w14="http://schemas.microsoft.com/office/word/2010/wordml" xmlns:w="http://schemas.openxmlformats.org/wordprocessingml/2006/main" xmlns:wne="http://schemas.microsoft.com/office/word/2006/wordml" xmlns:wp14="http://schemas.microsoft.com/office/word/2010/wordprocessingDrawing" xmlns:wp="http://schemas.openxmlformats.org/drawingml/2006/wordprocessingDrawing" xmlns:wpc="http://schemas.microsoft.com/office/word/2010/wordprocessingCanvas" xmlns:wpg="http://schemas.microsoft.com/office/word/2010/wordprocessingGroup" xmlns:wpi="http://schemas.microsoft.com/office/word/2010/wordprocessingInk" xmlns:wps="http://schemas.microsoft.com/office/word/2010/wordprocessingShape" mc:Ignorable="w14 wp14">
+  <w:p>
+    <w:pPr>
+      <w:pStyle w:val="Footer"/>
+      <w:jc w:val="center"/>
+    </w:pPr>
+    <w:r>
+      <w:rPr>
+        <w:color w:val="4B5563"/>
+        <w:sz w:val="16"/>
+      </w:rPr>
+      <w:t>Thyago Fernando da Silveira | CRQ-MG 2ª Região | CRQ 024025748 | Técnico em Química</w:t>
+    </w:r>
+  </w:p>
+</w:ftr>
+</file>
+
+<file path=word/header1.xml><?xml version="1.0" encoding="utf-8"?>
+<w:hdr xmlns:m="http://schemas.openxmlformats.org/officeDocument/2006/math" xmlns:mc="http://schemas.openxmlformats.org/markup-compatibility/2006" xmlns:mo="http://schemas.microsoft.com/office/mac/office/2008/main" xmlns:mv="urn:schemas-microsoft-com:mac:vml" xmlns:o="urn:schemas-microsoft-com:office:office" xmlns:r="http://schemas.openxmlformats.org/officeDocument/2006/relationships" xmlns:v="urn:schemas-microsoft-com:vml" xmlns:w10="urn:schemas-microsoft-com:office:word" xmlns:w14="http://schemas.microsoft.com/office/word/2010/wordml" xmlns:w="http://schemas.openxmlformats.org/wordprocessingml/2006/main" xmlns:wne="http://schemas.microsoft.com/office/word/2006/wordml" xmlns:wp14="http://schemas.microsoft.com/office/word/2010/wordprocessingDrawing" xmlns:wp="http://schemas.openxmlformats.org/drawingml/2006/wordprocessingDrawing" xmlns:wpc="http://schemas.microsoft.com/office/word/2010/wordprocessingCanvas" xmlns:wpg="http://schemas.microsoft.com/office/word/2010/wordprocessingGroup" xmlns:wpi="http://schemas.microsoft.com/office/word/2010/wordprocessingInk" xmlns:wps="http://schemas.microsoft.com/office/word/2010/wordprocessingShape" mc:Ignorable="w14 wp14">
+  <w:p>
+    <w:pPr>
+      <w:pStyle w:val="Header"/>
+      <w:jc w:val="center"/>
+    </w:pPr>
+    <w:r>
+      <w:rPr>
+        <w:b/>
+        <w:color w:val="0B2E59"/>
+        <w:sz w:val="18"/>
+      </w:rPr>
+      <w:t>AQUA GESTÃO – CONTROLE TÉCNICO DE PISCINAS</w:t>
+    </w:r>
+  </w:p>
+</w:hdr>
 </file>
 
 <file path=word/numbering.xml><?xml version="1.0" encoding="utf-8"?>
@@ -742,10 +984,6 @@
     <w:name w:val="Normal"/>
     <w:qFormat/>
     <w:rsid w:val="00FC693F"/>
-    <w:rPr>
-      <w:rFonts w:ascii="Arial" w:hAnsi="Arial"/>
-      <w:sz w:val="22"/>
-    </w:rPr>
   </w:style>
   <w:style w:type="paragraph" w:styleId="Header">
     <w:name w:val="header"/>

</xml_diff>